<commit_message>
Fix raw article extraction truncation and improve demo scripts
Fixes a preprocessing bug that truncated raw labor code articles to
their first sentence, which had been starving retrieval of context.
Also adds live-run output and rate-limit retry handling to the API
integration demo, and a presentation runbook.

Co-Authored-By: Claude Sonnet 5 <noreply@anthropic.com>
Claude-Session: https://claude.ai/code/session_01Kvhk9uwkQmBGU9sNoZVhso
</commit_message>
<xml_diff>
--- a/docs/Project_Proposal.docx
+++ b/docs/Project_Proposal.docx
@@ -14,6 +14,8 @@
           <w:szCs w:val="24"/>
         </w:rPr>
       </w:pPr>
+      <w:bookmarkStart w:id="8" w:name="_GoBack"/>
+      <w:bookmarkEnd w:id="8"/>
       <w:bookmarkStart w:id="0" w:name="_3wdub2s55tkx" w:colFirst="0" w:colLast="0"/>
       <w:bookmarkEnd w:id="0"/>
       <w:r>
@@ -237,8 +239,6 @@
         </w:rPr>
         <w:t>2. Problem Statement</w:t>
       </w:r>
-      <w:bookmarkStart w:id="8" w:name="_GoBack"/>
-      <w:bookmarkEnd w:id="8"/>
     </w:p>
     <w:p>
       <w:pPr>
@@ -436,7 +436,7 @@
           <w:color w:val="000000"/>
           <w:lang w:val="en-PH"/>
         </w:rPr>
-        <w:t xml:space="preserve"> 33 articles (~931 tokens) from Book One (Pre-Employment), Book Three (Conditions of Employment), and Book Six (Post-Employment); to be expanded with DOLE issuances in later checkpoints.</w:t>
+        <w:t xml:space="preserve"> 33 articles (~2,726 tokens) from Book One (Pre-Employment), Book Three (Conditions of Employment), and Book Six (Post-Employment); to be expanded with DOLE issuances in later checkpoints.</w:t>
       </w:r>
     </w:p>
     <w:p>

</xml_diff>